<commit_message>
data: catalogo de canodiy.es clasificado por propiedades y combinaciones
Excel y CSV con los 6.049 productos y 38 columnas de propiedades extraidas
por reglas del nombre comercial: grosor, cabos, formato, longitud, color
(nombre y codigo), maya/material/tipo de cremallera, ancho, acabado,
sistema y calibre de aguja, soporte, packs y pertenencia a los 6 kits
transversales (columnas one-hot).

Libro preparado para consumo por un LLM: tabla plana sin formulas ni
celdas combinadas, nombres de columna ASCII, booleanos normalizados y
hojas de diccionario, vocabulario y combinaciones.

Corrige el conteo de codigos de color del informe: 811 en hilos y 972 en
el catalogo completo (el patron anterior no captaba la variante "C/ 0263"
con espacio y contaba 370).

Co-Authored-By: Claude Opus 5 <noreply@anthropic.com>
Claude-Session: https://claude.ai/code/session_01WYGMFv5JnpU1D6pwyV6s1T
</commit_message>
<xml_diff>
--- a/docs/Canodiy - Catalogo agrupado por combinaciones afines.docx
+++ b/docs/Canodiy - Catalogo agrupado por combinaciones afines.docx
@@ -457,7 +457,7 @@
                 <w:sz w:val="18"/>
                 <w:szCs w:val="18"/>
               </w:rPr>
-              <w:t xml:space="preserve">data/canodiy-catalogo.csv (familia, categoría, nombre, referencia, precio, URL)</w:t>
+              <w:t xml:space="preserve">canodiy-catalogo-clasificado.xlsx — 6.049 filas × 38 columnas de propiedades y combinaciones</w:t>
             </w:r>
           </w:p>
         </w:tc>
@@ -3642,7 +3642,7 @@
                 <w:sz w:val="18"/>
                 <w:szCs w:val="18"/>
               </w:rPr>
-              <w:t xml:space="preserve">370 códigos de color distintos (C/0000 … C/3722)</w:t>
+              <w:t xml:space="preserve">811 códigos de color distintos en hilos (972 en todo el catálogo), rango C/0000 … C/9978</w:t>
             </w:r>
           </w:p>
         </w:tc>
@@ -10864,7 +10864,7 @@
           <w:sz w:val="20"/>
           <w:szCs w:val="20"/>
         </w:rPr>
-        <w:t xml:space="preserve">370 códigos de color conviven sin un diccionario común: el mismo C/0000 (negro) se repite en Mara, Tera y Serafil. Es la clave natural para agrupar y para recomendar equivalencias entre gamas.</w:t>
+        <w:t xml:space="preserve">811 códigos de color conviven en hilos sin un diccionario común —972 en el catálogo completo—: el mismo C/0000 (negro) se repite en Mara (452 códigos), Serafil (221), Tera (164) e Isacord (125). Es la clave natural para agrupar y para recomendar equivalencias entre gamas.</w:t>
       </w:r>
     </w:p>
     <w:p>

</xml_diff>